<commit_message>
Actualiza SIAN: auditoría integral, evidencia y registros v2
Integra identidad y fusión conservadora, etapas reanudables, caché y reintentos, almacenamiento transaccional, esquema v2, exportaciones y documentación.

Validación: 74 pruebas unitarias aprobadas. El corpus de tatuaje conserva 891 registros pendientes de revisión; no se atribuyen narrativas ni recepción sin evidencia.

Fuente local revisada: 6e74272360d183e8b36b881542ce97cd3f5abb53.
</commit_message>
<xml_diff>
--- a/publication/corpus_narrativo_tatuaje_humanidades_es.docx
+++ b/publication/corpus_narrativo_tatuaje_humanidades_es.docx
@@ -1201,6 +1201,59 @@
         <w:t>La selección de nodos relevantes puede formalizarse como cobertura sobre el mapa de relaciones. Se buscan conjuntos pequeños de nodos que mantengan alta relevancia y bajo daño estructural. Los detalles algorítmicos quedan como apéndice porque la pregunta principal es interpretativa.</w:t>
       </w:r>
     </w:p>
+    <w:p>
+      <w:r>
+        <w:br w:type="page"/>
+      </w:r>
+    </w:p>
+    <w:p>
+      <w:pPr>
+        <w:pStyle w:val="Heading1"/>
+      </w:pPr>
+      <w:r>
+        <w:t>Evidencia disponible y requisitos de análisis — 6 de octubre de 2026</w:t>
+      </w:r>
+    </w:p>
+    <w:p>
+      <w:r>
+        <w:t>Autoría, fechas y fuente se buscan, pero no se garantiza recuperarlas. Cada campo conserva valor, evidencia, método y estado: explícito, inferido, buscado y no encontrado, no evaluable, no aplica o contradictorio.</w:t>
+      </w:r>
+    </w:p>
+    <w:p>
+      <w:r>
+        <w:t>Publicación, actualización y consulta son fechas distintas. No se completan componentes ni se usa el año de búsqueda como publicación. Un enlace PDF no acredita texto completo recuperado.</w:t>
+      </w:r>
+    </w:p>
+    <w:p>
+      <w:r>
+        <w:t>Un documento sin autor o fecha sigue disponible para los análisis cuyos requisitos cumpla. Se reportan utilizables/total, exclusiones y cobertura por tipo de fuente. La cobertura no es representatividad.</w:t>
+      </w:r>
+    </w:p>
+    <w:p>
+      <w:r>
+        <w:t>La matriz documento–concepto distingue presencia revisada (1), ausencia explícitamente revisada (0) y dato desconocido (faltante). Las proporciones por fuente usan denominadores revisados para cada concepto. Apoyo, rechazo y ambivalencia permanecen separados.</w:t>
+      </w:r>
+    </w:p>
+    <w:p>
+      <w:r>
+        <w:t>Afirmaciones y relaciones requieren interpretación revisada y cita literal. La causalidad atribuida no es un efecto causal demostrado. Los conteos temporales usan la intersección revisada y fechada. Los módulos heurísticos anteriores generan candidatos, no conclusiones sociales validadas.</w:t>
+      </w:r>
+    </w:p>
+    <w:p>
+      <w:r>
+        <w:t>Pseudocódigo: recuperar procedencia y texto; buscar metadatos; conservar estados y conflictos; comprobar requisitos por análisis; validar citas; construir matrices descriptivas; exportar cobertura y limitaciones. El procedimiento ejecutable está en EVIDENCIA_Y_MODELOS.md.</w:t>
+      </w:r>
+    </w:p>
+    <w:p>
+      <w:r>
+        <w:t>Identidad y fusión de evidencia usan el mismo contrato de corpus en interfaz y comandos. Títulos similares y falta de detección léxica no acreditan identidad documental ni silencio intencional. El informe de auditoría integral documenta los límites del piloto.</w:t>
+      </w:r>
+    </w:p>
+    <w:p>
+      <w:r>
+        <w:t>El contrato v2 separa documentos, versiones y recuperaciones; incorpora etapas reanudables, reintentos limitados, caché y almacenamiento transaccional. El procesamiento de corpus guardados no simula nuevas descargas ni revisión humana. La especificación y pseudocódigo están en ARQUITECTURA_REGISTROS_V2.md.</w:t>
+      </w:r>
+    </w:p>
     <w:sectPr>
       <w:pgSz w:w="12240" w:h="15840"/>
       <w:pgMar w:top="1440" w:right="1440" w:bottom="1440" w:left="1440" w:header="720" w:footer="720" w:gutter="0"/>

</xml_diff>